<commit_message>
docs: verify remaining guides and refresh presentation and Office files
</commit_message>
<xml_diff>
--- a/docs/CONTENU_VAULT_V1.docx
+++ b/docs/CONTENU_VAULT_V1.docx
@@ -3,21 +3,8 @@
 <w:document xmlns:wpc="http://schemas.microsoft.com/office/word/2010/wordprocessingCanvas" xmlns:mo="http://schemas.microsoft.com/office/mac/office/2008/main" xmlns:mc="http://schemas.openxmlformats.org/markup-compatibility/2006" xmlns:mv="urn:schemas-microsoft-com:mac:vml" xmlns:o="urn:schemas-microsoft-com:office:office" xmlns:r="http://schemas.openxmlformats.org/officeDocument/2006/relationships" xmlns:m="http://schemas.openxmlformats.org/officeDocument/2006/math" xmlns:v="urn:schemas-microsoft-com:vml" xmlns:wp14="http://schemas.microsoft.com/office/word/2010/wordprocessingDrawing" xmlns:wp="http://schemas.openxmlformats.org/drawingml/2006/wordprocessingDrawing" xmlns:w10="urn:schemas-microsoft-com:office:word" xmlns:w="http://schemas.openxmlformats.org/wordprocessingml/2006/main" xmlns:w14="http://schemas.microsoft.com/office/word/2010/wordml" xmlns:wpg="http://schemas.microsoft.com/office/word/2010/wordprocessingGroup" xmlns:wpi="http://schemas.microsoft.com/office/word/2010/wordprocessingInk" xmlns:wne="http://schemas.microsoft.com/office/word/2006/wordml" xmlns:wps="http://schemas.microsoft.com/office/word/2010/wordprocessingShape" mc:Ignorable="w14 wp14">
   <w:body>
     <w:p>
-      <w:pPr>
-        <w:pStyle w:val="Title"/>
-      </w:pPr>
       <w:r>
-        <w:t>Ce que contient Vault</w:t>
-      </w:r>
-    </w:p>
-    <w:p>
-      <w:r>
-        <w:t>InfiMatch • Inventaire de l’installation locale V1 • 15 septembre 2026</w:t>
-      </w:r>
-    </w:p>
-    <w:p>
-      <w:r>
-        <w:t>Vault centralise les secrets nécessaires au backend et à son infrastructure. Ce document décrit leurs noms, leurs usages et les accès autorisés. Il ne contient aucune valeur de mot de passe, de clé ou de jeton.</w:t>
+        <w:t>Révision documentaire du 21 septembre 2026. Source maintenue : VAULT_V1.md. Les preuves datées et les réserves conservent leur portée ; ce document ne constitue pas une recette de production.</w:t>
       </w:r>
     </w:p>
     <w:p>
@@ -25,12 +12,38 @@
         <w:pStyle w:val="Heading1"/>
       </w:pPr>
       <w:r>
-        <w:t>1. État constaté</w:t>
+        <w:t>Gestion des secrets avec Vault</w:t>
       </w:r>
     </w:p>
     <w:p>
       <w:r>
-        <w:t>Dernière comparaison enregistrée : 2026-09-15T13:11:53.668Z (UTC). Vault était initialisé et déverrouillé. Les deux ensembles de secrets étaient en version 1, sans manque, différence ou clé supplémentaire par rapport au .env.</w:t>
+        <w:t>Référence documentaire au 21 septembre 2026. Ce guide décrit les responsabilités et l'outillage ; il n'atteste pas l'état courant du coffre ni une rotation récente. Aucune valeur secrète n'est incluse.</w:t>
+      </w:r>
+    </w:p>
+    <w:p>
+      <w:pPr>
+        <w:pStyle w:val="Heading2"/>
+      </w:pPr>
+      <w:r>
+        <w:t>Rôle du coffre</w:t>
+      </w:r>
+    </w:p>
+    <w:p>
+      <w:r>
+        <w:t>Vault est exploité localement avec stockage persistant et configuration TLS dans infra/vault/. Les scripts opérateur récupèrent les secrets nécessaires aux tâches autorisées. Les applications publiées utilisent leurs variables serveur Vercel et les credentials n8n : elles ne consultent pas ce coffre local à chaque requête.</w:t>
+      </w:r>
+    </w:p>
+    <w:p>
+      <w:r>
+        <w:t>Schéma ou code : consulter la version Markdown liée ci-dessus.</w:t>
+      </w:r>
+    </w:p>
+    <w:p>
+      <w:pPr>
+        <w:pStyle w:val="Heading2"/>
+      </w:pPr>
+      <w:r>
+        <w:t>Périmètres</w:t>
       </w:r>
     </w:p>
     <w:tbl>
@@ -40,452 +53,137 @@
         <w:tblLook w:firstColumn="1" w:firstRow="1" w:lastColumn="0" w:lastRow="0" w:noHBand="0" w:noVBand="1" w:val="04A0"/>
       </w:tblPr>
       <w:tblGrid>
-        <w:gridCol w:w="5112"/>
-        <w:gridCol w:w="5112"/>
+        <w:gridCol w:w="4320"/>
+        <w:gridCol w:w="4320"/>
       </w:tblGrid>
       <w:tr>
-        <w:trPr>
-          <w:cantSplit/>
-        </w:trPr>
         <w:tc>
           <w:tcPr>
-            <w:tcW w:type="dxa" w:w="5112"/>
+            <w:tcW w:type="dxa" w:w="4320"/>
           </w:tcPr>
           <w:p>
             <w:r>
-              <w:t>Élément</w:t>
+              <w:t>Périmètre</w:t>
             </w:r>
           </w:p>
         </w:tc>
         <w:tc>
           <w:tcPr>
-            <w:tcW w:type="dxa" w:w="5112"/>
+            <w:tcW w:type="dxa" w:w="4320"/>
           </w:tcPr>
           <w:p>
             <w:r>
-              <w:t>Contenu</w:t>
+              <w:t>Contenu / rôle</w:t>
             </w:r>
           </w:p>
         </w:tc>
       </w:tr>
       <w:tr>
-        <w:trPr>
-          <w:cantSplit/>
-        </w:trPr>
         <w:tc>
           <w:tcPr>
-            <w:tcW w:type="dxa" w:w="5112"/>
+            <w:tcW w:type="dxa" w:w="4320"/>
           </w:tcPr>
           <w:p>
             <w:r>
-              <w:t>Moteur de secrets</w:t>
+              <w:t>Backend local</w:t>
             </w:r>
           </w:p>
         </w:tc>
         <w:tc>
           <w:tcPr>
-            <w:tcW w:type="dxa" w:w="5112"/>
+            <w:tcW w:type="dxa" w:w="4320"/>
           </w:tcPr>
           <w:p>
             <w:r>
-              <w:t>KV v2 : stockage de paires nom/valeur avec versions.</w:t>
+              <w:t>Connexions de développement, sessions, chiffrement et accès aux services</w:t>
             </w:r>
           </w:p>
         </w:tc>
       </w:tr>
       <w:tr>
-        <w:trPr>
-          <w:cantSplit/>
-        </w:trPr>
         <w:tc>
           <w:tcPr>
-            <w:tcW w:type="dxa" w:w="5112"/>
+            <w:tcW w:type="dxa" w:w="4320"/>
           </w:tcPr>
           <w:p>
             <w:r>
-              <w:t>Dossier backend</w:t>
+              <w:t>Infrastructure locale</w:t>
             </w:r>
           </w:p>
         </w:tc>
         <w:tc>
           <w:tcPr>
-            <w:tcW w:type="dxa" w:w="5112"/>
+            <w:tcW w:type="dxa" w:w="4320"/>
           </w:tcPr>
           <w:p>
             <w:r>
-              <w:t>kv/infimatch/v1/backend : 8 entrées.</w:t>
+              <w:t>Secrets nécessaires aux conteneurs de développement</w:t>
             </w:r>
           </w:p>
         </w:tc>
       </w:tr>
       <w:tr>
-        <w:trPr>
-          <w:cantSplit/>
-        </w:trPr>
         <w:tc>
           <w:tcPr>
-            <w:tcW w:type="dxa" w:w="5112"/>
+            <w:tcW w:type="dxa" w:w="4320"/>
           </w:tcPr>
           <w:p>
             <w:r>
-              <w:t>Dossier infrastructure</w:t>
+              <w:t>Production</w:t>
             </w:r>
           </w:p>
         </w:tc>
         <w:tc>
           <w:tcPr>
-            <w:tcW w:type="dxa" w:w="5112"/>
+            <w:tcW w:type="dxa" w:w="4320"/>
           </w:tcPr>
           <w:p>
             <w:r>
-              <w:t>kv/infimatch/v1/infra : 4 entrées.</w:t>
+              <w:t>Connexions Supabase / Atlas, services externes et variables serveur</w:t>
             </w:r>
           </w:p>
         </w:tc>
       </w:tr>
       <w:tr>
-        <w:trPr>
-          <w:cantSplit/>
-        </w:trPr>
         <w:tc>
           <w:tcPr>
-            <w:tcW w:type="dxa" w:w="5112"/>
+            <w:tcW w:type="dxa" w:w="4320"/>
           </w:tcPr>
           <w:p>
             <w:r>
-              <w:t>Total</w:t>
+              <w:t>Opérateur</w:t>
             </w:r>
           </w:p>
         </w:tc>
         <w:tc>
           <w:tcPr>
-            <w:tcW w:type="dxa" w:w="5112"/>
+            <w:tcW w:type="dxa" w:w="4320"/>
           </w:tcPr>
           <w:p>
             <w:r>
-              <w:t>12 entrées réparties dans deux dossiers ; 11 secrets distincts car SERVICE_TOKEN est partagé.</w:t>
+              <w:t>Accès nécessaires aux migrations et opérations explicitement autorisées</w:t>
             </w:r>
           </w:p>
         </w:tc>
       </w:tr>
       <w:tr>
-        <w:trPr>
-          <w:cantSplit/>
-        </w:trPr>
         <w:tc>
           <w:tcPr>
-            <w:tcW w:type="dxa" w:w="5112"/>
+            <w:tcW w:type="dxa" w:w="4320"/>
           </w:tcPr>
           <w:p>
             <w:r>
-              <w:t>Adresse locale</w:t>
+              <w:t>Récupération</w:t>
             </w:r>
           </w:p>
         </w:tc>
         <w:tc>
           <w:tcPr>
-            <w:tcW w:type="dxa" w:w="5112"/>
+            <w:tcW w:type="dxa" w:w="4320"/>
           </w:tcPr>
           <w:p>
             <w:r>
-              <w:t>https://127.0.0.1:58200 — publiée uniquement sur la boucle locale du poste.</w:t>
-            </w:r>
-          </w:p>
-        </w:tc>
-      </w:tr>
-      <w:tr>
-        <w:trPr>
-          <w:cantSplit/>
-        </w:trPr>
-        <w:tc>
-          <w:tcPr>
-            <w:tcW w:type="dxa" w:w="5112"/>
-          </w:tcPr>
-          <w:p>
-            <w:r>
-              <w:t>Persistance</w:t>
-            </w:r>
-          </w:p>
-        </w:tc>
-        <w:tc>
-          <w:tcPr>
-            <w:tcW w:type="dxa" w:w="5112"/>
-          </w:tcPr>
-          <w:p>
-            <w:r>
-              <w:t>Stockage Raft dans un volume Docker ; journal d’audit dans un autre volume.</w:t>
-            </w:r>
-          </w:p>
-        </w:tc>
-      </w:tr>
-    </w:tbl>
-    <w:p>
-      <w:pPr>
-        <w:pStyle w:val="Heading1"/>
-      </w:pPr>
-      <w:r>
-        <w:t>2. Ce que Vault ne remplace pas</w:t>
-      </w:r>
-    </w:p>
-    <w:p>
-      <w:r>
-        <w:t>Les profils, missions et candidatures restent dans PostgreSQL. Les résultats et explications du matching interne restent dans MongoDB. Les documents privés restent dans le stockage de fichiers chiffrés. Vault conserve les secrets permettant d’utiliser ces services, pas leurs données métier.</w:t>
-      </w:r>
-    </w:p>
-    <w:p>
-      <w:r>
-        <w:t>Le .env historique existe encore pour les anciennes commandes. L’installation locale de Vault ne prouve pas à elle seule la sécurisation complète de l’environnement livré.</w:t>
-      </w:r>
-    </w:p>
-    <w:p>
-      <w:r>
-        <w:br w:type="page"/>
-      </w:r>
-    </w:p>
-    <w:p>
-      <w:pPr>
-        <w:pStyle w:val="Heading1"/>
-      </w:pPr>
-      <w:r>
-        <w:t>3. Secrets du backend</w:t>
-      </w:r>
-    </w:p>
-    <w:p>
-      <w:r>
-        <w:t>Chemin logique : kv/infimatch/v1/backend. Chemin API KV v2 : kv/data/infimatch/v1/backend.</w:t>
-      </w:r>
-    </w:p>
-    <w:tbl>
-      <w:tblPr>
-        <w:tblStyle w:val="LightShading-Accent1"/>
-        <w:tblW w:type="auto" w:w="0"/>
-        <w:tblLook w:firstColumn="1" w:firstRow="1" w:lastColumn="0" w:lastRow="0" w:noHBand="0" w:noVBand="1" w:val="04A0"/>
-      </w:tblPr>
-      <w:tblGrid>
-        <w:gridCol w:w="5112"/>
-        <w:gridCol w:w="5112"/>
-      </w:tblGrid>
-      <w:tr>
-        <w:trPr>
-          <w:cantSplit/>
-        </w:trPr>
-        <w:tc>
-          <w:tcPr>
-            <w:tcW w:type="dxa" w:w="5112"/>
-          </w:tcPr>
-          <w:p>
-            <w:r>
-              <w:t>Nom</w:t>
-            </w:r>
-          </w:p>
-        </w:tc>
-        <w:tc>
-          <w:tcPr>
-            <w:tcW w:type="dxa" w:w="5112"/>
-          </w:tcPr>
-          <w:p>
-            <w:r>
-              <w:t>Utilité</w:t>
-            </w:r>
-          </w:p>
-        </w:tc>
-      </w:tr>
-      <w:tr>
-        <w:trPr>
-          <w:cantSplit/>
-        </w:trPr>
-        <w:tc>
-          <w:tcPr>
-            <w:tcW w:type="dxa" w:w="5112"/>
-          </w:tcPr>
-          <w:p>
-            <w:r>
-              <w:t>DATABASE_URL</w:t>
-            </w:r>
-          </w:p>
-        </w:tc>
-        <w:tc>
-          <w:tcPr>
-            <w:tcW w:type="dxa" w:w="5112"/>
-          </w:tcPr>
-          <w:p>
-            <w:r>
-              <w:t>Chaîne de connexion à PostgreSQL, contenant notamment les identifiants de connexion.</w:t>
-            </w:r>
-          </w:p>
-        </w:tc>
-      </w:tr>
-      <w:tr>
-        <w:trPr>
-          <w:cantSplit/>
-        </w:trPr>
-        <w:tc>
-          <w:tcPr>
-            <w:tcW w:type="dxa" w:w="5112"/>
-          </w:tcPr>
-          <w:p>
-            <w:r>
-              <w:t>MONGODB_URI</w:t>
-            </w:r>
-          </w:p>
-        </w:tc>
-        <w:tc>
-          <w:tcPr>
-            <w:tcW w:type="dxa" w:w="5112"/>
-          </w:tcPr>
-          <w:p>
-            <w:r>
-              <w:t>Chaîne de connexion à MongoDB pour les résultats et explications du matching.</w:t>
-            </w:r>
-          </w:p>
-        </w:tc>
-      </w:tr>
-      <w:tr>
-        <w:trPr>
-          <w:cantSplit/>
-        </w:trPr>
-        <w:tc>
-          <w:tcPr>
-            <w:tcW w:type="dxa" w:w="5112"/>
-          </w:tcPr>
-          <w:p>
-            <w:r>
-              <w:t>SESSION_SECRET</w:t>
-            </w:r>
-          </w:p>
-        </w:tc>
-        <w:tc>
-          <w:tcPr>
-            <w:tcW w:type="dxa" w:w="5112"/>
-          </w:tcPr>
-          <w:p>
-            <w:r>
-              <w:t>Secret de sécurité des sessions du backend.</w:t>
-            </w:r>
-          </w:p>
-        </w:tc>
-      </w:tr>
-      <w:tr>
-        <w:trPr>
-          <w:cantSplit/>
-        </w:trPr>
-        <w:tc>
-          <w:tcPr>
-            <w:tcW w:type="dxa" w:w="5112"/>
-          </w:tcPr>
-          <w:p>
-            <w:r>
-              <w:t>DOCUMENT_KEY</w:t>
-            </w:r>
-          </w:p>
-        </w:tc>
-        <w:tc>
-          <w:tcPr>
-            <w:tcW w:type="dxa" w:w="5112"/>
-          </w:tcPr>
-          <w:p>
-            <w:r>
-              <w:t>Clé de chiffrement des documents privés. Sa conservation est nécessaire pour relire les fichiers concernés.</w:t>
-            </w:r>
-          </w:p>
-        </w:tc>
-      </w:tr>
-      <w:tr>
-        <w:trPr>
-          <w:cantSplit/>
-        </w:trPr>
-        <w:tc>
-          <w:tcPr>
-            <w:tcW w:type="dxa" w:w="5112"/>
-          </w:tcPr>
-          <w:p>
-            <w:r>
-              <w:t>SERVICE_TOKEN</w:t>
-            </w:r>
-          </w:p>
-        </w:tc>
-        <w:tc>
-          <w:tcPr>
-            <w:tcW w:type="dxa" w:w="5112"/>
-          </w:tcPr>
-          <w:p>
-            <w:r>
-              <w:t>Secret partagé pour authentifier les échanges internes avec les automatisations n8n.</w:t>
-            </w:r>
-          </w:p>
-        </w:tc>
-      </w:tr>
-      <w:tr>
-        <w:trPr>
-          <w:cantSplit/>
-        </w:trPr>
-        <w:tc>
-          <w:tcPr>
-            <w:tcW w:type="dxa" w:w="5112"/>
-          </w:tcPr>
-          <w:p>
-            <w:r>
-              <w:t>RPPS_API_KEY</w:t>
-            </w:r>
-          </w:p>
-        </w:tc>
-        <w:tc>
-          <w:tcPr>
-            <w:tcW w:type="dxa" w:w="5112"/>
-          </w:tcPr>
-          <w:p>
-            <w:r>
-              <w:t>Clé d’accès au fournisseur Annuaire Santé / RPPS.</w:t>
-            </w:r>
-          </w:p>
-        </w:tc>
-      </w:tr>
-      <w:tr>
-        <w:trPr>
-          <w:cantSplit/>
-        </w:trPr>
-        <w:tc>
-          <w:tcPr>
-            <w:tcW w:type="dxa" w:w="5112"/>
-          </w:tcPr>
-          <w:p>
-            <w:r>
-              <w:t>FT_CLIENT_ID</w:t>
-            </w:r>
-          </w:p>
-        </w:tc>
-        <w:tc>
-          <w:tcPr>
-            <w:tcW w:type="dxa" w:w="5112"/>
-          </w:tcPr>
-          <w:p>
-            <w:r>
-              <w:t>Identifiant client de l’intégration France Travail.</w:t>
-            </w:r>
-          </w:p>
-        </w:tc>
-      </w:tr>
-      <w:tr>
-        <w:trPr>
-          <w:cantSplit/>
-        </w:trPr>
-        <w:tc>
-          <w:tcPr>
-            <w:tcW w:type="dxa" w:w="5112"/>
-          </w:tcPr>
-          <w:p>
-            <w:r>
-              <w:t>FT_CLIENT_SECRET</w:t>
-            </w:r>
-          </w:p>
-        </w:tc>
-        <w:tc>
-          <w:tcPr>
-            <w:tcW w:type="dxa" w:w="5112"/>
-          </w:tcPr>
-          <w:p>
-            <w:r>
-              <w:t>Secret client associé à l’intégration France Travail.</w:t>
+              <w:t>Moyens privés de restauration du coffre, exclus de Git</w:t>
             </w:r>
           </w:p>
         </w:tc>
@@ -493,701 +191,15 @@
     </w:tbl>
     <w:p>
       <w:r>
-        <w:t>Le chargeur prévoit également les noms DOCUMENT_KEY_Vn pour conserver des clés documentaires versionnées. Aucun de ces champs supplémentaires ne figure dans l’inventaire vérifié.</w:t>
+        <w:t>Consulter l'inventaire des variables (quality/CONFIGURATION.md) pour les noms et leurs usages. Le rôle applicatif ne remplace pas les accès privilégiés de migration. Les variables VITE_* sont publiques et ne doivent contenir aucune de ces valeurs.</w:t>
       </w:r>
     </w:p>
     <w:p>
       <w:pPr>
-        <w:pStyle w:val="Heading1"/>
+        <w:pStyle w:val="Heading2"/>
       </w:pPr>
       <w:r>
-        <w:t>4. Secrets de l’infrastructure</w:t>
-      </w:r>
-    </w:p>
-    <w:p>
-      <w:r>
-        <w:t>Chemin logique : kv/infimatch/v1/infra. Chemin API KV v2 : kv/data/infimatch/v1/infra.</w:t>
-      </w:r>
-    </w:p>
-    <w:tbl>
-      <w:tblPr>
-        <w:tblStyle w:val="LightShading-Accent1"/>
-        <w:tblW w:type="auto" w:w="0"/>
-        <w:tblLook w:firstColumn="1" w:firstRow="1" w:lastColumn="0" w:lastRow="0" w:noHBand="0" w:noVBand="1" w:val="04A0"/>
-      </w:tblPr>
-      <w:tblGrid>
-        <w:gridCol w:w="5112"/>
-        <w:gridCol w:w="5112"/>
-      </w:tblGrid>
-      <w:tr>
-        <w:trPr>
-          <w:cantSplit/>
-        </w:trPr>
-        <w:tc>
-          <w:tcPr>
-            <w:tcW w:type="dxa" w:w="5112"/>
-          </w:tcPr>
-          <w:p>
-            <w:r>
-              <w:t>Nom</w:t>
-            </w:r>
-          </w:p>
-        </w:tc>
-        <w:tc>
-          <w:tcPr>
-            <w:tcW w:type="dxa" w:w="5112"/>
-          </w:tcPr>
-          <w:p>
-            <w:r>
-              <w:t>Utilité</w:t>
-            </w:r>
-          </w:p>
-        </w:tc>
-      </w:tr>
-      <w:tr>
-        <w:trPr>
-          <w:cantSplit/>
-        </w:trPr>
-        <w:tc>
-          <w:tcPr>
-            <w:tcW w:type="dxa" w:w="5112"/>
-          </w:tcPr>
-          <w:p>
-            <w:r>
-              <w:t>POSTGRES_PASSWORD</w:t>
-            </w:r>
-          </w:p>
-        </w:tc>
-        <w:tc>
-          <w:tcPr>
-            <w:tcW w:type="dxa" w:w="5112"/>
-          </w:tcPr>
-          <w:p>
-            <w:r>
-              <w:t>Mot de passe fourni à la configuration du service PostgreSQL.</w:t>
-            </w:r>
-          </w:p>
-        </w:tc>
-      </w:tr>
-      <w:tr>
-        <w:trPr>
-          <w:cantSplit/>
-        </w:trPr>
-        <w:tc>
-          <w:tcPr>
-            <w:tcW w:type="dxa" w:w="5112"/>
-          </w:tcPr>
-          <w:p>
-            <w:r>
-              <w:t>MONGO_PASSWORD</w:t>
-            </w:r>
-          </w:p>
-        </w:tc>
-        <w:tc>
-          <w:tcPr>
-            <w:tcW w:type="dxa" w:w="5112"/>
-          </w:tcPr>
-          <w:p>
-            <w:r>
-              <w:t>Mot de passe fourni à la configuration du service MongoDB.</w:t>
-            </w:r>
-          </w:p>
-        </w:tc>
-      </w:tr>
-      <w:tr>
-        <w:trPr>
-          <w:cantSplit/>
-        </w:trPr>
-        <w:tc>
-          <w:tcPr>
-            <w:tcW w:type="dxa" w:w="5112"/>
-          </w:tcPr>
-          <w:p>
-            <w:r>
-              <w:t>N8N_ENCRYPTION_KEY</w:t>
-            </w:r>
-          </w:p>
-        </w:tc>
-        <w:tc>
-          <w:tcPr>
-            <w:tcW w:type="dxa" w:w="5112"/>
-          </w:tcPr>
-          <w:p>
-            <w:r>
-              <w:t>Clé utilisée par n8n pour chiffrer ses identifiants enregistrés.</w:t>
-            </w:r>
-          </w:p>
-        </w:tc>
-      </w:tr>
-      <w:tr>
-        <w:trPr>
-          <w:cantSplit/>
-        </w:trPr>
-        <w:tc>
-          <w:tcPr>
-            <w:tcW w:type="dxa" w:w="5112"/>
-          </w:tcPr>
-          <w:p>
-            <w:r>
-              <w:t>SERVICE_TOKEN</w:t>
-            </w:r>
-          </w:p>
-        </w:tc>
-        <w:tc>
-          <w:tcPr>
-            <w:tcW w:type="dxa" w:w="5112"/>
-          </w:tcPr>
-          <w:p>
-            <w:r>
-              <w:t>Même secret de communication interne que dans le dossier backend.</w:t>
-            </w:r>
-          </w:p>
-        </w:tc>
-      </w:tr>
-    </w:tbl>
-    <w:p>
-      <w:r>
-        <w:t>Copier une nouvelle valeur dans Vault ne modifie pas automatiquement le mot de passe d’une base déjà initialisée. Tout changement doit rester cohérent entre le serveur et ses clients.</w:t>
-      </w:r>
-    </w:p>
-    <w:p>
-      <w:r>
-        <w:br w:type="page"/>
-      </w:r>
-    </w:p>
-    <w:p>
-      <w:pPr>
-        <w:pStyle w:val="Heading1"/>
-      </w:pPr>
-      <w:r>
-        <w:t>5. Qui peut lire ou modifier ces secrets ?</w:t>
-      </w:r>
-    </w:p>
-    <w:p>
-      <w:r>
-        <w:t>L’accès applicatif utilise AppRole : une identité de rôle et un identifiant secret permettent d’obtenir un jeton temporaire.</w:t>
-      </w:r>
-    </w:p>
-    <w:tbl>
-      <w:tblPr>
-        <w:tblStyle w:val="LightShading-Accent1"/>
-        <w:tblW w:type="auto" w:w="0"/>
-        <w:tblLook w:firstColumn="1" w:firstRow="1" w:lastColumn="0" w:lastRow="0" w:noHBand="0" w:noVBand="1" w:val="04A0"/>
-      </w:tblPr>
-      <w:tblGrid>
-        <w:gridCol w:w="5112"/>
-        <w:gridCol w:w="5112"/>
-      </w:tblGrid>
-      <w:tr>
-        <w:trPr>
-          <w:cantSplit/>
-        </w:trPr>
-        <w:tc>
-          <w:tcPr>
-            <w:tcW w:type="dxa" w:w="5112"/>
-          </w:tcPr>
-          <w:p>
-            <w:r>
-              <w:t>Rôle</w:t>
-            </w:r>
-          </w:p>
-        </w:tc>
-        <w:tc>
-          <w:tcPr>
-            <w:tcW w:type="dxa" w:w="5112"/>
-          </w:tcPr>
-          <w:p>
-            <w:r>
-              <w:t>Permissions configurées</w:t>
-            </w:r>
-          </w:p>
-        </w:tc>
-      </w:tr>
-      <w:tr>
-        <w:trPr>
-          <w:cantSplit/>
-        </w:trPr>
-        <w:tc>
-          <w:tcPr>
-            <w:tcW w:type="dxa" w:w="5112"/>
-          </w:tcPr>
-          <w:p>
-            <w:r>
-              <w:t>infimatch-v1-backend</w:t>
-            </w:r>
-          </w:p>
-        </w:tc>
-        <w:tc>
-          <w:tcPr>
-            <w:tcW w:type="dxa" w:w="5112"/>
-          </w:tcPr>
-          <w:p>
-            <w:r>
-              <w:t>Lecture du seul dossier backend V1. Pas d’écriture, ni d’accès au dossier infra, à V2 ou à l’administration.</w:t>
-            </w:r>
-          </w:p>
-        </w:tc>
-      </w:tr>
-      <w:tr>
-        <w:trPr>
-          <w:cantSplit/>
-        </w:trPr>
-        <w:tc>
-          <w:tcPr>
-            <w:tcW w:type="dxa" w:w="5112"/>
-          </w:tcPr>
-          <w:p>
-            <w:r>
-              <w:t>infimatch-v1-infra</w:t>
-            </w:r>
-          </w:p>
-        </w:tc>
-        <w:tc>
-          <w:tcPr>
-            <w:tcW w:type="dxa" w:w="5112"/>
-          </w:tcPr>
-          <w:p>
-            <w:r>
-              <w:t>Lecture du seul dossier infra V1. Pas d’accès aux secrets backend.</w:t>
-            </w:r>
-          </w:p>
-        </w:tc>
-      </w:tr>
-      <w:tr>
-        <w:trPr>
-          <w:cantSplit/>
-        </w:trPr>
-        <w:tc>
-          <w:tcPr>
-            <w:tcW w:type="dxa" w:w="5112"/>
-          </w:tcPr>
-          <w:p>
-            <w:r>
-              <w:t>infimatch-v1-operator</w:t>
-            </w:r>
-          </w:p>
-        </w:tc>
-        <w:tc>
-          <w:tcPr>
-            <w:tcW w:type="dxa" w:w="5112"/>
-          </w:tcPr>
-          <w:p>
-            <w:r>
-              <w:t>Lecture et écriture des secrets V1, lecture des métadonnées, gestion des SecretID AppRole V1 et création de snapshots Raft.</w:t>
-            </w:r>
-          </w:p>
-        </w:tc>
-      </w:tr>
-    </w:tbl>
-    <w:p>
-      <w:r>
-        <w:t>Les rôles ne reçoivent pas la policy default. Les jetons ont une durée configurée de 5 minutes, avec un maximum de 10 minutes. Les lanceurs révoquent leur jeton après lecture, avant de démarrer le processus.</w:t>
-      </w:r>
-    </w:p>
-    <w:p>
-      <w:r>
-        <w:t>Durées configurées des SecretID : 7 jours pour backend et infra, 30 jours pour operator. Le renouvellement doit être organisé avant expiration. Le jeton root initial a été révoqué ; aucun jeton root permanent n’est prévu pour l’usage courant.</w:t>
-      </w:r>
-    </w:p>
-    <w:p>
-      <w:pPr>
-        <w:pStyle w:val="Heading1"/>
-      </w:pPr>
-      <w:r>
-        <w:t>6. Fichiers associés, conservés hors du KV</w:t>
-      </w:r>
-    </w:p>
-    <w:p>
-      <w:r>
-        <w:t>Le répertoire local data/vault/ est ignoré par Git et protégé par les droits du poste. Il contient des moyens d’accès ou de récupération sensibles, distincts des 11 secrets métier inventoriés.</w:t>
-      </w:r>
-    </w:p>
-    <w:tbl>
-      <w:tblPr>
-        <w:tblStyle w:val="LightShading-Accent1"/>
-        <w:tblW w:type="auto" w:w="0"/>
-        <w:tblLook w:firstColumn="1" w:firstRow="1" w:lastColumn="0" w:lastRow="0" w:noHBand="0" w:noVBand="1" w:val="04A0"/>
-      </w:tblPr>
-      <w:tblGrid>
-        <w:gridCol w:w="5112"/>
-        <w:gridCol w:w="5112"/>
-      </w:tblGrid>
-      <w:tr>
-        <w:trPr>
-          <w:cantSplit/>
-        </w:trPr>
-        <w:tc>
-          <w:tcPr>
-            <w:tcW w:type="dxa" w:w="5112"/>
-          </w:tcPr>
-          <w:p>
-            <w:r>
-              <w:t>Fichiers / éléments</w:t>
-            </w:r>
-          </w:p>
-        </w:tc>
-        <w:tc>
-          <w:tcPr>
-            <w:tcW w:type="dxa" w:w="5112"/>
-          </w:tcPr>
-          <w:p>
-            <w:r>
-              <w:t>Rôle</w:t>
-            </w:r>
-          </w:p>
-        </w:tc>
-      </w:tr>
-      <w:tr>
-        <w:trPr>
-          <w:cantSplit/>
-        </w:trPr>
-        <w:tc>
-          <w:tcPr>
-            <w:tcW w:type="dxa" w:w="5112"/>
-          </w:tcPr>
-          <w:p>
-            <w:r>
-              <w:t>backend.json, infra.json, operator.json</w:t>
-            </w:r>
-          </w:p>
-        </w:tc>
-        <w:tc>
-          <w:tcPr>
-            <w:tcW w:type="dxa" w:w="5112"/>
-          </w:tcPr>
-          <w:p>
-            <w:r>
-              <w:t>Identifiants AppRole locaux, accessors et informations de durée de vie.</w:t>
-            </w:r>
-          </w:p>
-        </w:tc>
-      </w:tr>
-      <w:tr>
-        <w:trPr>
-          <w:cantSplit/>
-        </w:trPr>
-        <w:tc>
-          <w:tcPr>
-            <w:tcW w:type="dxa" w:w="5112"/>
-          </w:tcPr>
-          <w:p>
-            <w:r>
-              <w:t>recovery.json</w:t>
-            </w:r>
-          </w:p>
-        </w:tc>
-        <w:tc>
-          <w:tcPr>
-            <w:tcW w:type="dxa" w:w="5112"/>
-          </w:tcPr>
-          <w:p>
-            <w:r>
-              <w:t>Parts de déverrouillage Shamir : trois parts générées, deux nécessaires.</w:t>
-            </w:r>
-          </w:p>
-        </w:tc>
-      </w:tr>
-      <w:tr>
-        <w:trPr>
-          <w:cantSplit/>
-        </w:trPr>
-        <w:tc>
-          <w:tcPr>
-            <w:tcW w:type="dxa" w:w="5112"/>
-          </w:tcPr>
-          <w:p>
-            <w:r>
-              <w:t>ca.key et tls/</w:t>
-            </w:r>
-          </w:p>
-        </w:tc>
-        <w:tc>
-          <w:tcPr>
-            <w:tcW w:type="dxa" w:w="5112"/>
-          </w:tcPr>
-          <w:p>
-            <w:r>
-              <w:t>Clés privées et certificats utilisés pour HTTPS local.</w:t>
-            </w:r>
-          </w:p>
-        </w:tc>
-      </w:tr>
-      <w:tr>
-        <w:trPr>
-          <w:cantSplit/>
-        </w:trPr>
-        <w:tc>
-          <w:tcPr>
-            <w:tcW w:type="dxa" w:w="5112"/>
-          </w:tcPr>
-          <w:p>
-            <w:r>
-              <w:t>runtime.json</w:t>
-            </w:r>
-          </w:p>
-        </w:tc>
-        <w:tc>
-          <w:tcPr>
-            <w:tcW w:type="dxa" w:w="5112"/>
-          </w:tcPr>
-          <w:p>
-            <w:r>
-              <w:t>Configuration d’exécution non secrète : environnement, port, origine et paramètres autorisés.</w:t>
-            </w:r>
-          </w:p>
-        </w:tc>
-      </w:tr>
-      <w:tr>
-        <w:trPr>
-          <w:cantSplit/>
-        </w:trPr>
-        <w:tc>
-          <w:tcPr>
-            <w:tcW w:type="dxa" w:w="5112"/>
-          </w:tcPr>
-          <w:p>
-            <w:r>
-              <w:t>raft-*.snap</w:t>
-            </w:r>
-          </w:p>
-        </w:tc>
-        <w:tc>
-          <w:tcPr>
-            <w:tcW w:type="dxa" w:w="5112"/>
-          </w:tcPr>
-          <w:p>
-            <w:r>
-              <w:t>Copies de sauvegarde du stockage Raft, à traiter comme sensibles.</w:t>
-            </w:r>
-          </w:p>
-        </w:tc>
-      </w:tr>
-    </w:tbl>
-    <w:p>
-      <w:r>
-        <w:t>Les trois parts sont actuellement regroupées sur le poste. Leur séparation entre responsables et leur sauvegarde sécurisée hors du poste restent à organiser. Ces fichiers ne doivent pas être inclus dans les archives de conversation.</w:t>
-      </w:r>
-    </w:p>
-    <w:p>
-      <w:r>
-        <w:br w:type="page"/>
-      </w:r>
-    </w:p>
-    <w:p>
-      <w:pPr>
-        <w:pStyle w:val="Heading1"/>
-      </w:pPr>
-      <w:r>
-        <w:t>7. Utilisation et mise à jour</w:t>
-      </w:r>
-    </w:p>
-    <w:tbl>
-      <w:tblPr>
-        <w:tblStyle w:val="LightShading-Accent1"/>
-        <w:tblW w:type="auto" w:w="0"/>
-        <w:tblLook w:firstColumn="1" w:firstRow="1" w:lastColumn="0" w:lastRow="0" w:noHBand="0" w:noVBand="1" w:val="04A0"/>
-      </w:tblPr>
-      <w:tblGrid>
-        <w:gridCol w:w="5112"/>
-        <w:gridCol w:w="5112"/>
-      </w:tblGrid>
-      <w:tr>
-        <w:trPr>
-          <w:cantSplit/>
-        </w:trPr>
-        <w:tc>
-          <w:tcPr>
-            <w:tcW w:type="dxa" w:w="5112"/>
-          </w:tcPr>
-          <w:p>
-            <w:r>
-              <w:t>Commande depuis InfiMatch</w:t>
-            </w:r>
-          </w:p>
-        </w:tc>
-        <w:tc>
-          <w:tcPr>
-            <w:tcW w:type="dxa" w:w="5112"/>
-          </w:tcPr>
-          <w:p>
-            <w:r>
-              <w:t>Effet</w:t>
-            </w:r>
-          </w:p>
-        </w:tc>
-      </w:tr>
-      <w:tr>
-        <w:trPr>
-          <w:cantSplit/>
-        </w:trPr>
-        <w:tc>
-          <w:tcPr>
-            <w:tcW w:type="dxa" w:w="5112"/>
-          </w:tcPr>
-          <w:p>
-            <w:r>
-              <w:t>npm run vault:status</w:t>
-            </w:r>
-          </w:p>
-        </w:tc>
-        <w:tc>
-          <w:tcPr>
-            <w:tcW w:type="dxa" w:w="5112"/>
-          </w:tcPr>
-          <w:p>
-            <w:r>
-              <w:t>Affiche l’état de Vault, sans afficher les secrets.</w:t>
-            </w:r>
-          </w:p>
-        </w:tc>
-      </w:tr>
-      <w:tr>
-        <w:trPr>
-          <w:cantSplit/>
-        </w:trPr>
-        <w:tc>
-          <w:tcPr>
-            <w:tcW w:type="dxa" w:w="5112"/>
-          </w:tcPr>
-          <w:p>
-            <w:r>
-              <w:t>npm run vault:check</w:t>
-            </w:r>
-          </w:p>
-        </w:tc>
-        <w:tc>
-          <w:tcPr>
-            <w:tcW w:type="dxa" w:w="5112"/>
-          </w:tcPr>
-          <w:p>
-            <w:r>
-              <w:t>Vérifie le chargement de la configuration et la connexion PostgreSQL.</w:t>
-            </w:r>
-          </w:p>
-        </w:tc>
-      </w:tr>
-      <w:tr>
-        <w:trPr>
-          <w:cantSplit/>
-        </w:trPr>
-        <w:tc>
-          <w:tcPr>
-            <w:tcW w:type="dxa" w:w="5112"/>
-          </w:tcPr>
-          <w:p>
-            <w:r>
-              <w:t>npm run start:vault</w:t>
-            </w:r>
-          </w:p>
-        </w:tc>
-        <w:tc>
-          <w:tcPr>
-            <w:tcW w:type="dxa" w:w="5112"/>
-          </w:tcPr>
-          <w:p>
-            <w:r>
-              <w:t>Démarre l’API compilée avec les secrets lus dans Vault.</w:t>
-            </w:r>
-          </w:p>
-        </w:tc>
-      </w:tr>
-      <w:tr>
-        <w:trPr>
-          <w:cantSplit/>
-        </w:trPr>
-        <w:tc>
-          <w:tcPr>
-            <w:tcW w:type="dxa" w:w="5112"/>
-          </w:tcPr>
-          <w:p>
-            <w:r>
-              <w:t>npm run worker:vault</w:t>
-            </w:r>
-          </w:p>
-        </w:tc>
-        <w:tc>
-          <w:tcPr>
-            <w:tcW w:type="dxa" w:w="5112"/>
-          </w:tcPr>
-          <w:p>
-            <w:r>
-              <w:t>Démarre le worker avec les secrets lus dans Vault.</w:t>
-            </w:r>
-          </w:p>
-        </w:tc>
-      </w:tr>
-      <w:tr>
-        <w:trPr>
-          <w:cantSplit/>
-        </w:trPr>
-        <w:tc>
-          <w:tcPr>
-            <w:tcW w:type="dxa" w:w="5112"/>
-          </w:tcPr>
-          <w:p>
-            <w:r>
-              <w:t>npm run vault:sync</w:t>
-            </w:r>
-          </w:p>
-        </w:tc>
-        <w:tc>
-          <w:tcPr>
-            <w:tcW w:type="dxa" w:w="5112"/>
-          </w:tcPr>
-          <w:p>
-            <w:r>
-              <w:t>Copie les valeurs autorisées du .env vers le KV et met à jour runtime.json.</w:t>
-            </w:r>
-          </w:p>
-        </w:tc>
-      </w:tr>
-      <w:tr>
-        <w:trPr>
-          <w:cantSplit/>
-        </w:trPr>
-        <w:tc>
-          <w:tcPr>
-            <w:tcW w:type="dxa" w:w="5112"/>
-          </w:tcPr>
-          <w:p>
-            <w:r>
-              <w:t>npm run vault:snapshot</w:t>
-            </w:r>
-          </w:p>
-        </w:tc>
-        <w:tc>
-          <w:tcPr>
-            <w:tcW w:type="dxa" w:w="5112"/>
-          </w:tcPr>
-          <w:p>
-            <w:r>
-              <w:t>Crée un snapshot privé du stockage Raft.</w:t>
-            </w:r>
-          </w:p>
-        </w:tc>
-      </w:tr>
-    </w:tbl>
-    <w:p>
-      <w:r>
-        <w:t>La synchronisation est explicite : aucun suivi permanent du .env n’est installé. Avant toute synchronisation, comparer les valeurs en mémoire, comprendre les écarts et ne transférer que les changements voulus. Ne jamais afficher les valeurs dans les logs ou dans ce document.</w:t>
-      </w:r>
-    </w:p>
-    <w:p>
-      <w:r>
-        <w:t>Après modification d’un secret utilisé par un processus, prévoir son redémarrage contrôlé et vérifier le fonctionnement. Les lanceurs lisent les secrets au démarrage ; ils ne les actualisent pas en continu. En mode Vault, le backend ne se rabat pas sur le .env si Vault est indisponible.</w:t>
-      </w:r>
-    </w:p>
-    <w:p>
-      <w:r>
-        <w:t>La commande vault:rotate prépare le renouvellement des accès AppRole ; sa rotation réelle n’a pas été validée. Elle est distincte de la synchronisation du .env et de la rotation des mots de passe des bases ou des clés documentaires.</w:t>
-      </w:r>
-    </w:p>
-    <w:p>
-      <w:pPr>
-        <w:pStyle w:val="Heading1"/>
-      </w:pPr>
-      <w:r>
-        <w:t>8. Vérifications et limites</w:t>
+        <w:t>Bonnes pratiques d'exploitation du projet</w:t>
       </w:r>
     </w:p>
     <w:p>
@@ -1195,7 +207,7 @@
         <w:pStyle w:val="ListBullet"/>
       </w:pPr>
       <w:r>
-        <w:t>Preuves précédentes : 10 tests Vault réussis ; reprise après redémarrage, persistance, connexion PostgreSQL et santé d’une API de recette vérifiées.</w:t>
+        <w:t>Utiliser le rôle correspondant à l'opération ; ne pas utiliser un accès root pour l'exploitation courante.</w:t>
       </w:r>
     </w:p>
     <w:p>
@@ -1203,7 +215,7 @@
         <w:pStyle w:val="ListBullet"/>
       </w:pPr>
       <w:r>
-        <w:t>La comparaison du 15 septembre confirme 11 secrets distincts à jour ; aucune écriture supplémentaire n’était nécessaire.</w:t>
+        <w:t>Conserver les identifiants et moyens de récupération dans les emplacements privés, hors dépôt et hors dossier de rendu.</w:t>
       </w:r>
     </w:p>
     <w:p>
@@ -1211,7 +223,7 @@
         <w:pStyle w:val="ListBullet"/>
       </w:pPr>
       <w:r>
-        <w:t>Restent à valider : restauration sur une instance distincte, renouvellement réel des accès et bascule des processus utilisant encore le .env.</w:t>
+        <w:t>Lors d'une rotation documentaire, conserver les versions nécessaires au déchiffrement des anciens fichiers.</w:t>
       </w:r>
     </w:p>
     <w:p>
@@ -1219,7 +231,7 @@
         <w:pStyle w:val="ListBullet"/>
       </w:pPr>
       <w:r>
-        <w:t>Interface Edge corrigée le 15 septembre 2026 : formulaire de connexion affiché après suppression de la demande facultative de certificat client. HTTPS et AppRole conservés ; 10 tests Vault réussis.</w:t>
+        <w:t>Répliquer uniquement les variables serveur nécessaires, puis redéployer les composants concernés et vérifier leur comportement.</w:t>
       </w:r>
     </w:p>
     <w:p>
@@ -1227,40 +239,32 @@
         <w:pStyle w:val="ListBullet"/>
       </w:pPr>
       <w:r>
-        <w:t>Le dossier V2 existe pour la préparation du projet. Aucun dossier de secrets V2 n’est inclus dans cet inventaire.</w:t>
+        <w:t>Sauvegarder le coffre et ses moyens de récupération selon la procédure autorisée. Une sauvegarde Git n'inclut ni le coffre ni les bases ni les credentials cloud.</w:t>
       </w:r>
     </w:p>
     <w:p>
       <w:pPr>
-        <w:pStyle w:val="Heading1"/>
+        <w:pStyle w:val="Heading2"/>
       </w:pPr>
       <w:r>
-        <w:t>Sources locales</w:t>
+        <w:t>Preuves et limites</w:t>
       </w:r>
     </w:p>
     <w:p>
       <w:r>
-        <w:t>scripts/vault/common.mjs ; scripts/vault/manage.mjs ; scripts/vault/run.mjs ; infra/vault/server.hcl ; infra/vault/compose.yaml ; docs/VAULT_V1.md ; docs/proofs/vault-env-comparison.json et vault-lifecycle.json.</w:t>
-      </w:r>
-    </w:p>
-    <w:p>
-      <w:pPr>
-        <w:pStyle w:val="Heading1"/>
-      </w:pPr>
-      <w:r>
-        <w:t>Acces personnel ajoute le 15 septembre 2026</w:t>
+        <w:t>L'installation, les essais isolés, une rotation effective et une restauration indépendante sont des validations différentes. La présence d'un script n'atteste pas son exécution. Le dossier de rendu doit conserver la date et la portée des preuves sans afficher de clé, d'invitation ou de QR MFA.</w:t>
       </w:r>
     </w:p>
     <w:p>
       <w:r>
-        <w:t>Compte lebre, methode Userpass : consultation des secrets V1, sans modification ni administration. Connexion dans le navigateur verifiee. Le jeton root temporaire a ete revoque. Les identifiants sont remis uniquement dans le dossier prive data/vault/ ; aucune valeur secrete dans ce document. Cet acces est distinct des 11 secrets applicatifs KV.</w:t>
+        <w:t>Configuration (quality/CONFIGURATION.md) · Sauvegardes (quality/SAUVEGARDES_OPERATIONNELLES_2026-09-19.md) · Reprise (quality/EXPLOITATION_REPRISE.md) · Architecture (SCHEMA_ARCHITECTURE_V1.md).</w:t>
       </w:r>
     </w:p>
     <w:sectPr>
       <w:headerReference w:type="default" r:id="rId9"/>
       <w:footerReference w:type="default" r:id="rId10"/>
       <w:pgSz w:w="12240" w:h="15840"/>
-      <w:pgMar w:top="936" w:right="1008" w:bottom="936" w:left="1008" w:header="720" w:footer="720" w:gutter="0"/>
+      <w:pgMar w:top="1440" w:right="1800" w:bottom="1440" w:left="1800" w:header="720" w:footer="720" w:gutter="0"/>
       <w:cols w:space="720"/>
       <w:docGrid w:linePitch="360"/>
     </w:sectPr>
@@ -1275,9 +279,8 @@
       <w:pStyle w:val="Footer"/>
     </w:pPr>
     <w:r>
-      <w:t xml:space="preserve">Document sans valeurs secrètes • 15 septembre 2026   |   </w:t>
+      <w:t>Projet étudiant | Référence courante : fichier Markdown du dépôt</w:t>
     </w:r>
-    <w:fldSimple w:instr="PAGE"/>
   </w:p>
 </w:ftr>
 </file>
@@ -1289,7 +292,7 @@
       <w:pStyle w:val="Header"/>
     </w:pPr>
     <w:r>
-      <w:t>INFIMATCH  |  BACKEND V1  |  INVENTAIRE VAULT</w:t>
+      <w:t>InfiMatch | Documentation du projet</w:t>
     </w:r>
   </w:p>
 </w:hdr>
@@ -1658,12 +661,9 @@
     <w:name w:val="Normal"/>
     <w:qFormat/>
     <w:rsid w:val="00FC693F"/>
-    <w:pPr>
-      <w:spacing w:after="120"/>
-    </w:pPr>
     <w:rPr>
       <w:rFonts w:ascii="Calibri" w:hAnsi="Calibri"/>
-      <w:sz w:val="20"/>
+      <w:sz w:val="22"/>
     </w:rPr>
   </w:style>
   <w:style w:type="paragraph" w:styleId="Header">
@@ -1728,7 +728,7 @@
       <w:rFonts w:asciiTheme="majorHAnsi" w:eastAsiaTheme="majorEastAsia" w:hAnsiTheme="majorHAnsi" w:cstheme="majorBidi"/>
       <w:b/>
       <w:bCs/>
-      <w:color w:val="17365D"/>
+      <w:color w:val="365F91" w:themeColor="accent1" w:themeShade="BF"/>
       <w:sz w:val="28"/>
       <w:szCs w:val="28"/>
     </w:rPr>
@@ -1752,7 +752,7 @@
       <w:rFonts w:asciiTheme="majorHAnsi" w:eastAsiaTheme="majorEastAsia" w:hAnsiTheme="majorHAnsi" w:cstheme="majorBidi"/>
       <w:b/>
       <w:bCs/>
-      <w:color w:val="17365D"/>
+      <w:color w:val="4F81BD" w:themeColor="accent1"/>
       <w:sz w:val="26"/>
       <w:szCs w:val="26"/>
     </w:rPr>
@@ -2015,7 +1015,7 @@
     </w:pPr>
     <w:rPr>
       <w:rFonts w:asciiTheme="majorHAnsi" w:eastAsiaTheme="majorEastAsia" w:hAnsiTheme="majorHAnsi" w:cstheme="majorBidi"/>
-      <w:color w:val="17365D"/>
+      <w:color w:val="17365D" w:themeColor="text2" w:themeShade="BF"/>
       <w:spacing w:val="5"/>
       <w:kern w:val="28"/>
       <w:sz w:val="52"/>

</xml_diff>